<commit_message>
Restyle website documentation as plain document
</commit_message>
<xml_diff>
--- a/docs/kiva-website-documentation.docx
+++ b/docs/kiva-website-documentation.docx
@@ -6,8 +6,7 @@
       <w:pPr>
         <w:pStyle w:val="Heading1"/>
         <w:bidi w:val="0"/>
-        <w:spacing w:before="240" w:after="120"/>
-        <w:jc w:val="start"/>
+        <w:spacing w:before="240" w:after="270"/>
         <w:rPr/>
       </w:pPr>
       <w:r>
@@ -19,23 +18,21 @@
       <w:pPr>
         <w:pStyle w:val="BodyText"/>
         <w:bidi w:val="0"/>
-        <w:spacing w:before="300" w:after="420"/>
-        <w:ind w:hanging="0" w:start="300" w:end="300"/>
+        <w:spacing w:before="0" w:after="300"/>
+        <w:ind w:hanging="0" w:start="0" w:end="0"/>
         <w:jc w:val="start"/>
         <w:rPr/>
       </w:pPr>
       <w:r>
         <w:rPr>
           <w:rStyle w:val="Strong"/>
-          <w:bdr w:val="single" w:sz="12" w:space="12" w:color="161512"/>
-          <w:shd w:fill="FFFAF1" w:val="clear"/>
+          <w:shd w:fill="F7F7F7" w:val="clear"/>
         </w:rPr>
         <w:t>Adres strony:</w:t>
       </w:r>
       <w:r>
         <w:rPr>
-          <w:bdr w:val="single" w:sz="12" w:space="12" w:color="161512"/>
-          <w:shd w:fill="FFFAF1" w:val="clear"/>
+          <w:shd w:fill="F7F7F7" w:val="clear"/>
         </w:rPr>
         <w:t xml:space="preserve"> </w:t>
       </w:r>
@@ -43,8 +40,7 @@
         <w:r>
           <w:rPr>
             <w:rStyle w:val="Hyperlink"/>
-            <w:bdr w:val="single" w:sz="12" w:space="12" w:color="161512"/>
-            <w:shd w:fill="FFFAF1" w:val="clear"/>
+            <w:shd w:fill="F7F7F7" w:val="clear"/>
           </w:rPr>
           <w:t>https://kiva-roastery.michael-sakhnenko.workers.dev/kategorie/espresso/</w:t>
         </w:r>
@@ -54,23 +50,20 @@
       <w:pPr>
         <w:pStyle w:val="BodyText"/>
         <w:bidi w:val="0"/>
-        <w:spacing w:before="300" w:after="420"/>
-        <w:ind w:hanging="0" w:start="300" w:end="300"/>
+        <w:spacing w:before="0" w:after="300"/>
         <w:jc w:val="start"/>
         <w:rPr/>
       </w:pPr>
       <w:r>
         <w:rPr>
           <w:rStyle w:val="Strong"/>
-          <w:bdr w:val="single" w:sz="12" w:space="12" w:color="161512"/>
-          <w:shd w:fill="FFFAF1" w:val="clear"/>
+          <w:shd w:fill="F7F7F7" w:val="clear"/>
         </w:rPr>
         <w:t>Typ projektu:</w:t>
       </w:r>
       <w:r>
         <w:rPr>
-          <w:bdr w:val="single" w:sz="12" w:space="12" w:color="161512"/>
-          <w:shd w:fill="FFFAF1" w:val="clear"/>
+          <w:shd w:fill="F7F7F7" w:val="clear"/>
         </w:rPr>
         <w:t xml:space="preserve"> sklep internetowy / strona produktowa palarni kawy specialty.</w:t>
       </w:r>
@@ -79,23 +72,20 @@
       <w:pPr>
         <w:pStyle w:val="BodyText"/>
         <w:bidi w:val="0"/>
-        <w:spacing w:before="300" w:after="420"/>
-        <w:ind w:hanging="0" w:start="300" w:end="300"/>
+        <w:spacing w:before="0" w:after="300"/>
         <w:jc w:val="start"/>
         <w:rPr/>
       </w:pPr>
       <w:r>
         <w:rPr>
           <w:rStyle w:val="Strong"/>
-          <w:bdr w:val="single" w:sz="12" w:space="12" w:color="161512"/>
-          <w:shd w:fill="FFFAF1" w:val="clear"/>
+          <w:shd w:fill="F7F7F7" w:val="clear"/>
         </w:rPr>
         <w:t>Główne technologie:</w:t>
       </w:r>
       <w:r>
         <w:rPr>
-          <w:bdr w:val="single" w:sz="12" w:space="12" w:color="161512"/>
-          <w:shd w:fill="FFFAF1" w:val="clear"/>
+          <w:shd w:fill="F7F7F7" w:val="clear"/>
         </w:rPr>
         <w:t xml:space="preserve"> Astro, statyczny build, Cloudflare Workers/Pages, HTML, CSS, JavaScript.</w:t>
       </w:r>
@@ -103,258 +93,249 @@
     <w:p>
       <w:pPr>
         <w:pStyle w:val="Heading2"/>
-        <w:bidi w:val="0"/>
-        <w:ind w:hanging="0"/>
-        <w:jc w:val="start"/>
-        <w:rPr/>
-      </w:pPr>
-      <w:r>
-        <w:rPr/>
-        <w:t>Opis projektu</w:t>
-      </w:r>
-    </w:p>
-    <w:p>
-      <w:pPr>
-        <w:pStyle w:val="BodyText"/>
-        <w:bidi w:val="0"/>
-        <w:spacing w:before="0" w:after="283"/>
-        <w:jc w:val="start"/>
-        <w:rPr/>
-      </w:pPr>
-      <w:r>
-        <w:rPr/>
-        <w:t xml:space="preserve">KIVA to strona dla fikcyjnej palarni kawy specialty. Jej zadaniem jest prezentacja marki, pokazanie oferty kaw ziarnistych oraz ułatwienie wyboru produktu według metody parzenia, profilu smakowego, kraju pochodzenia, procesu obróbki i ceny. </w:t>
-      </w:r>
-    </w:p>
-    <w:p>
-      <w:pPr>
-        <w:pStyle w:val="BodyText"/>
-        <w:bidi w:val="0"/>
-        <w:spacing w:before="0" w:after="283"/>
-        <w:jc w:val="start"/>
-        <w:rPr/>
-      </w:pPr>
-      <w:r>
-        <w:rPr/>
-        <w:t xml:space="preserve">Strona ma charakter sklepowy: użytkownik może przejść do listy produktów, filtrować kawy, otwierać podstrony kategorii i produktów oraz korzystać z lekkiego koszyka frontendowego. Warstwa wizualna opiera się na mocnej typografii, kontrastowych liniach, dużych zdjęciach opakowań oraz prostych, czytelnych interakcjach. </w:t>
-      </w:r>
-    </w:p>
-    <w:p>
-      <w:pPr>
-        <w:pStyle w:val="BodyText"/>
-        <w:bidi w:val="0"/>
-        <w:spacing w:before="45" w:after="45"/>
-        <w:ind w:hanging="0" w:start="60" w:end="60"/>
-        <w:jc w:val="start"/>
-        <w:rPr/>
-      </w:pPr>
-      <w:r>
-        <w:rPr/>
-        <w:t xml:space="preserve">Najważniejsze elementy strony: </w:t>
-      </w:r>
-      <w:r>
-        <w:rPr>
-          <w:b/>
-          <w:caps/>
-          <w:sz w:val="18"/>
-        </w:rPr>
-        <w:t>homepage</w:t>
-      </w:r>
-      <w:r>
-        <w:rPr/>
-        <w:t xml:space="preserve"> </w:t>
-      </w:r>
-      <w:r>
-        <w:rPr>
-          <w:b/>
-          <w:caps/>
-          <w:sz w:val="18"/>
-        </w:rPr>
-        <w:t>lista produktów</w:t>
-      </w:r>
-      <w:r>
-        <w:rPr/>
-        <w:t xml:space="preserve"> </w:t>
-      </w:r>
-      <w:r>
-        <w:rPr>
-          <w:b/>
-          <w:caps/>
-          <w:sz w:val="18"/>
-        </w:rPr>
-        <w:t>kategorie</w:t>
-      </w:r>
-      <w:r>
-        <w:rPr/>
-        <w:t xml:space="preserve"> </w:t>
-      </w:r>
-      <w:r>
-        <w:rPr>
-          <w:b/>
-          <w:caps/>
-          <w:sz w:val="18"/>
-        </w:rPr>
-        <w:t>filtry</w:t>
-      </w:r>
-      <w:r>
-        <w:rPr/>
-        <w:t xml:space="preserve"> </w:t>
-      </w:r>
-      <w:r>
-        <w:rPr>
-          <w:b/>
-          <w:caps/>
-          <w:sz w:val="18"/>
-        </w:rPr>
-        <w:t>koszyk</w:t>
-      </w:r>
-      <w:r>
-        <w:rPr/>
-        <w:t xml:space="preserve"> </w:t>
-      </w:r>
-      <w:r>
-        <w:rPr>
-          <w:b/>
-          <w:caps/>
-          <w:sz w:val="18"/>
-        </w:rPr>
-        <w:t>blog</w:t>
-      </w:r>
-      <w:r>
-        <w:rPr/>
-        <w:t xml:space="preserve"> </w:t>
-      </w:r>
-      <w:r>
-        <w:rPr>
-          <w:b/>
-          <w:caps/>
-          <w:sz w:val="18"/>
-        </w:rPr>
-        <w:t>kontakt</w:t>
-      </w:r>
-      <w:r>
-        <w:rPr/>
-        <w:t xml:space="preserve"> </w:t>
-      </w:r>
-      <w:r>
-        <w:rPr>
-          <w:b/>
-          <w:caps/>
-          <w:sz w:val="18"/>
-        </w:rPr>
-        <w:t>SEO</w:t>
-      </w:r>
-      <w:r>
-        <w:rPr/>
-        <w:t xml:space="preserve"> </w:t>
-      </w:r>
-      <w:r>
-        <w:rPr>
-          <w:b/>
-          <w:caps/>
-          <w:sz w:val="18"/>
-        </w:rPr>
-        <w:t>automatyzacja rabatu</w:t>
-      </w:r>
-      <w:r>
-        <w:rPr/>
-        <w:t xml:space="preserve"> </w:t>
-      </w:r>
-    </w:p>
-    <w:p>
-      <w:pPr>
-        <w:pStyle w:val="Heading2"/>
+        <w:keepNext w:val="true"/>
         <w:numPr>
           <w:ilvl w:val="0"/>
           <w:numId w:val="0"/>
         </w:numPr>
-        <w:pBdr>
-          <w:top w:val="single" w:sz="12" w:space="14" w:color="161512"/>
-        </w:pBdr>
-        <w:bidi w:val="0"/>
-        <w:spacing w:lineRule="auto" w:line="252" w:before="510" w:after="120"/>
-        <w:ind w:start="600"/>
-        <w:jc w:val="start"/>
-        <w:rPr/>
-      </w:pPr>
-      <w:r>
-        <w:rPr/>
-        <w:t>Struktura i zawartość</w:t>
-      </w:r>
-    </w:p>
-    <w:p>
-      <w:pPr>
-        <w:pStyle w:val="BodyText"/>
-        <w:bidi w:val="0"/>
-        <w:spacing w:before="0" w:after="283"/>
-        <w:jc w:val="start"/>
-        <w:rPr/>
-      </w:pPr>
-      <w:r>
-        <w:rPr/>
-        <w:t xml:space="preserve">Strona zawiera stronę główną, katalog produktów, osobne podstrony produktów, blog, kontakt, stronę 404 oraz podstrony kategorii. Kategorie są dostępne z menu nawigacji oraz z filtrów w katalogu produktów. </w:t>
-      </w:r>
-    </w:p>
-    <w:p>
-      <w:pPr>
-        <w:pStyle w:val="BodyText"/>
-        <w:bidi w:val="0"/>
-        <w:spacing w:before="0" w:after="283"/>
-        <w:jc w:val="start"/>
-        <w:rPr/>
-      </w:pPr>
-      <w:r>
-        <w:rPr/>
-        <w:t xml:space="preserve">Podstrony kategorii mają teraz dodatkowy opis pod listą produktów. Każda kategoria zawiera trzy nagłówki H2 z krótkimi opisami: zastosowanie kawy, profil smakowy oraz sugestię wyboru. Dzięki temu podstrony kategorii mają więcej treści SEO, ale nadal wyglądają jak część sklepu, a nie długi artykuł. </w:t>
+        <w:bidi w:val="0"/>
+        <w:spacing w:lineRule="auto" w:line="288" w:before="360" w:after="120"/>
+        <w:ind w:start="360" w:end="360"/>
+        <w:jc w:val="start"/>
+        <w:rPr/>
+      </w:pPr>
+      <w:r>
+        <w:rPr/>
+        <w:t>Opis projektu</w:t>
+      </w:r>
+    </w:p>
+    <w:p>
+      <w:pPr>
+        <w:pStyle w:val="BodyText"/>
+        <w:bidi w:val="0"/>
+        <w:spacing w:before="0" w:after="150"/>
+        <w:jc w:val="start"/>
+        <w:rPr/>
+      </w:pPr>
+      <w:r>
+        <w:rPr/>
+        <w:t xml:space="preserve">KIVA to strona dla fikcyjnej palarni kawy specialty. Jej zadaniem jest prezentacja marki, pokazanie oferty kaw ziarnistych oraz ułatwienie wyboru produktu według metody parzenia, profilu smakowego, kraju pochodzenia, procesu obróbki i ceny. </w:t>
+      </w:r>
+    </w:p>
+    <w:p>
+      <w:pPr>
+        <w:pStyle w:val="BodyText"/>
+        <w:bidi w:val="0"/>
+        <w:spacing w:before="0" w:after="150"/>
+        <w:jc w:val="start"/>
+        <w:rPr/>
+      </w:pPr>
+      <w:r>
+        <w:rPr/>
+        <w:t xml:space="preserve">Strona ma charakter sklepowy: użytkownik może przejść do listy produktów, filtrować kawy, otwierać podstrony kategorii i produktów oraz korzystać z lekkiego koszyka frontendowego. Warstwa wizualna opiera się na mocnej typografii, kontrastowych liniach, dużych zdjęciach opakowań oraz prostych, czytelnych interakcjach. </w:t>
+      </w:r>
+    </w:p>
+    <w:p>
+      <w:pPr>
+        <w:pStyle w:val="BodyText"/>
+        <w:bidi w:val="0"/>
+        <w:spacing w:before="30" w:after="30"/>
+        <w:ind w:hanging="0" w:start="60" w:end="60"/>
+        <w:jc w:val="start"/>
+        <w:rPr/>
+      </w:pPr>
+      <w:r>
+        <w:rPr/>
+        <w:t xml:space="preserve">Najważniejsze elementy strony: </w:t>
+      </w:r>
+      <w:r>
+        <w:rPr>
+          <w:sz w:val="20"/>
+          <w:shd w:fill="F2F2F2" w:val="clear"/>
+        </w:rPr>
+        <w:t>homepage</w:t>
+      </w:r>
+      <w:r>
+        <w:rPr/>
+        <w:t xml:space="preserve"> </w:t>
+      </w:r>
+      <w:r>
+        <w:rPr>
+          <w:sz w:val="20"/>
+          <w:shd w:fill="F2F2F2" w:val="clear"/>
+        </w:rPr>
+        <w:t>lista produktów</w:t>
+      </w:r>
+      <w:r>
+        <w:rPr/>
+        <w:t xml:space="preserve"> </w:t>
+      </w:r>
+      <w:r>
+        <w:rPr>
+          <w:sz w:val="20"/>
+          <w:shd w:fill="F2F2F2" w:val="clear"/>
+        </w:rPr>
+        <w:t>kategorie</w:t>
+      </w:r>
+      <w:r>
+        <w:rPr/>
+        <w:t xml:space="preserve"> </w:t>
+      </w:r>
+      <w:r>
+        <w:rPr>
+          <w:sz w:val="20"/>
+          <w:shd w:fill="F2F2F2" w:val="clear"/>
+        </w:rPr>
+        <w:t>filtry</w:t>
+      </w:r>
+      <w:r>
+        <w:rPr/>
+        <w:t xml:space="preserve"> </w:t>
+      </w:r>
+      <w:r>
+        <w:rPr>
+          <w:sz w:val="20"/>
+          <w:shd w:fill="F2F2F2" w:val="clear"/>
+        </w:rPr>
+        <w:t>koszyk</w:t>
+      </w:r>
+      <w:r>
+        <w:rPr/>
+        <w:t xml:space="preserve"> </w:t>
+      </w:r>
+      <w:r>
+        <w:rPr>
+          <w:sz w:val="20"/>
+          <w:shd w:fill="F2F2F2" w:val="clear"/>
+        </w:rPr>
+        <w:t>blog</w:t>
+      </w:r>
+      <w:r>
+        <w:rPr/>
+        <w:t xml:space="preserve"> </w:t>
+      </w:r>
+      <w:r>
+        <w:rPr>
+          <w:sz w:val="20"/>
+          <w:shd w:fill="F2F2F2" w:val="clear"/>
+        </w:rPr>
+        <w:t>kontakt</w:t>
+      </w:r>
+      <w:r>
+        <w:rPr/>
+        <w:t xml:space="preserve"> </w:t>
+      </w:r>
+      <w:r>
+        <w:rPr>
+          <w:sz w:val="20"/>
+          <w:shd w:fill="F2F2F2" w:val="clear"/>
+        </w:rPr>
+        <w:t>SEO</w:t>
+      </w:r>
+      <w:r>
+        <w:rPr/>
+        <w:t xml:space="preserve"> </w:t>
+      </w:r>
+      <w:r>
+        <w:rPr>
+          <w:sz w:val="20"/>
+          <w:shd w:fill="F2F2F2" w:val="clear"/>
+        </w:rPr>
+        <w:t>automatyzacja rabatu</w:t>
+      </w:r>
+      <w:r>
+        <w:rPr/>
+        <w:t xml:space="preserve"> </w:t>
       </w:r>
     </w:p>
     <w:p>
       <w:pPr>
         <w:pStyle w:val="Heading2"/>
+        <w:keepNext w:val="true"/>
         <w:numPr>
           <w:ilvl w:val="0"/>
           <w:numId w:val="0"/>
         </w:numPr>
-        <w:pBdr>
-          <w:top w:val="single" w:sz="12" w:space="14" w:color="161512"/>
-        </w:pBdr>
-        <w:bidi w:val="0"/>
-        <w:spacing w:lineRule="auto" w:line="252" w:before="510" w:after="120"/>
-        <w:ind w:start="600"/>
-        <w:jc w:val="start"/>
-        <w:rPr/>
-      </w:pPr>
-      <w:r>
-        <w:rPr/>
-        <w:t>SEO i dostępność</w:t>
-      </w:r>
-    </w:p>
-    <w:p>
-      <w:pPr>
-        <w:pStyle w:val="BodyText"/>
-        <w:bidi w:val="0"/>
-        <w:spacing w:before="0" w:after="283"/>
-        <w:jc w:val="start"/>
-        <w:rPr/>
-      </w:pPr>
-      <w:r>
-        <w:rPr/>
-        <w:t xml:space="preserve">Strona ma tytuły meta, opisy meta, kanoniczne adresy URL, poprawne nagłówki H1/H2, opisy alternatywne obrazów, mapę strony oraz plik robots.txt. Blog korzysta ze schema Article JSON-LD. Podczas budowania projektu uruchamiana jest walidacja SEO dla wygenerowanych plików HTML. </w:t>
+        <w:bidi w:val="0"/>
+        <w:spacing w:lineRule="auto" w:line="288" w:before="360" w:after="120"/>
+        <w:ind w:start="360" w:end="360"/>
+        <w:jc w:val="start"/>
+        <w:rPr/>
+      </w:pPr>
+      <w:r>
+        <w:rPr/>
+        <w:t>Struktura i zawartość</w:t>
+      </w:r>
+    </w:p>
+    <w:p>
+      <w:pPr>
+        <w:pStyle w:val="BodyText"/>
+        <w:bidi w:val="0"/>
+        <w:spacing w:before="0" w:after="150"/>
+        <w:jc w:val="start"/>
+        <w:rPr/>
+      </w:pPr>
+      <w:r>
+        <w:rPr/>
+        <w:t xml:space="preserve">Strona zawiera stronę główną, katalog produktów, osobne podstrony produktów, blog, kontakt, stronę 404 oraz podstrony kategorii. Kategorie są dostępne z menu nawigacji oraz z filtrów w katalogu produktów. </w:t>
+      </w:r>
+    </w:p>
+    <w:p>
+      <w:pPr>
+        <w:pStyle w:val="BodyText"/>
+        <w:bidi w:val="0"/>
+        <w:spacing w:before="0" w:after="150"/>
+        <w:jc w:val="start"/>
+        <w:rPr/>
+      </w:pPr>
+      <w:r>
+        <w:rPr/>
+        <w:t xml:space="preserve">Podstrony kategorii mają teraz dodatkowy opis pod listą produktów. Każda kategoria zawiera trzy nagłówki H2 z krótkimi opisami: zastosowanie kawy, profil smakowy oraz sugestię wyboru. Dzięki temu podstrony kategorii mają więcej treści SEO, ale nadal wyglądają jak część sklepu, a nie długi artykuł. </w:t>
       </w:r>
     </w:p>
     <w:p>
       <w:pPr>
         <w:pStyle w:val="Heading2"/>
+        <w:keepNext w:val="true"/>
         <w:numPr>
           <w:ilvl w:val="0"/>
           <w:numId w:val="0"/>
         </w:numPr>
-        <w:pBdr>
-          <w:top w:val="single" w:sz="12" w:space="14" w:color="161512"/>
-        </w:pBdr>
-        <w:bidi w:val="0"/>
-        <w:spacing w:lineRule="auto" w:line="252" w:before="510" w:after="120"/>
-        <w:ind w:start="600"/>
+        <w:bidi w:val="0"/>
+        <w:spacing w:lineRule="auto" w:line="288" w:before="360" w:after="120"/>
+        <w:ind w:start="360" w:end="360"/>
+        <w:jc w:val="start"/>
+        <w:rPr/>
+      </w:pPr>
+      <w:r>
+        <w:rPr/>
+        <w:t>SEO i dostępność</w:t>
+      </w:r>
+    </w:p>
+    <w:p>
+      <w:pPr>
+        <w:pStyle w:val="BodyText"/>
+        <w:bidi w:val="0"/>
+        <w:spacing w:before="0" w:after="150"/>
+        <w:jc w:val="start"/>
+        <w:rPr/>
+      </w:pPr>
+      <w:r>
+        <w:rPr/>
+        <w:t xml:space="preserve">Strona ma tytuły meta, opisy meta, kanoniczne adresy URL, poprawne nagłówki H1/H2, opisy alternatywne obrazów, mapę strony oraz plik robots.txt. Blog korzysta ze schema Article JSON-LD. Podczas budowania projektu uruchamiana jest walidacja SEO dla wygenerowanych plików HTML. </w:t>
+      </w:r>
+    </w:p>
+    <w:p>
+      <w:pPr>
+        <w:pStyle w:val="Heading2"/>
+        <w:keepNext w:val="true"/>
+        <w:numPr>
+          <w:ilvl w:val="0"/>
+          <w:numId w:val="0"/>
+        </w:numPr>
+        <w:bidi w:val="0"/>
+        <w:spacing w:lineRule="auto" w:line="288" w:before="360" w:after="120"/>
+        <w:ind w:start="360" w:end="360"/>
         <w:jc w:val="start"/>
         <w:rPr/>
       </w:pPr>
@@ -367,7 +348,7 @@
       <w:pPr>
         <w:pStyle w:val="BodyText"/>
         <w:bidi w:val="0"/>
-        <w:spacing w:before="0" w:after="283"/>
+        <w:spacing w:before="0" w:after="150"/>
         <w:jc w:val="start"/>
         <w:rPr/>
       </w:pPr>
@@ -390,7 +371,7 @@
       <w:pPr>
         <w:pStyle w:val="BodyText"/>
         <w:bidi w:val="0"/>
-        <w:spacing w:before="0" w:after="283"/>
+        <w:spacing w:before="0" w:after="150"/>
         <w:jc w:val="start"/>
         <w:rPr/>
       </w:pPr>
@@ -427,7 +408,7 @@
       <w:pPr>
         <w:pStyle w:val="BodyText"/>
         <w:bidi w:val="0"/>
-        <w:spacing w:before="0" w:after="283"/>
+        <w:spacing w:before="0" w:after="150"/>
         <w:jc w:val="start"/>
         <w:rPr/>
       </w:pPr>
@@ -439,16 +420,14 @@
     <w:p>
       <w:pPr>
         <w:pStyle w:val="Heading2"/>
+        <w:keepNext w:val="true"/>
         <w:numPr>
           <w:ilvl w:val="0"/>
           <w:numId w:val="0"/>
         </w:numPr>
-        <w:pBdr>
-          <w:top w:val="single" w:sz="12" w:space="14" w:color="161512"/>
-        </w:pBdr>
-        <w:bidi w:val="0"/>
-        <w:spacing w:lineRule="auto" w:line="252" w:before="510" w:after="120"/>
-        <w:ind w:start="600"/>
+        <w:bidi w:val="0"/>
+        <w:spacing w:lineRule="auto" w:line="288" w:before="360" w:after="120"/>
+        <w:ind w:start="360" w:end="360"/>
         <w:jc w:val="start"/>
         <w:rPr/>
       </w:pPr>
@@ -461,7 +440,7 @@
       <w:pPr>
         <w:pStyle w:val="BodyText"/>
         <w:bidi w:val="0"/>
-        <w:spacing w:before="0" w:after="283"/>
+        <w:spacing w:before="0" w:after="150"/>
         <w:jc w:val="start"/>
         <w:rPr/>
       </w:pPr>
@@ -657,7 +636,7 @@
       <w:pgNumType w:fmt="decimal"/>
       <w:formProt w:val="false"/>
       <w:textDirection w:val="lrTb"/>
-      <w:docGrid w:type="default" w:linePitch="600" w:charSpace="32768"/>
+      <w:docGrid w:type="default" w:linePitch="600" w:charSpace="36864"/>
     </w:sectPr>
   </w:body>
 </w:document>
@@ -689,14 +668,14 @@
       <w:overflowPunct w:val="true"/>
       <w:autoSpaceDE w:val="true"/>
       <w:bidi w:val="0"/>
-      <w:spacing w:lineRule="auto" w:line="348" w:before="600" w:after="600"/>
-      <w:ind w:start="600" w:end="600"/>
+      <w:spacing w:lineRule="auto" w:line="324" w:before="1247" w:after="1247"/>
+      <w:ind w:start="1247" w:end="1247"/>
     </w:pPr>
     <w:rPr>
-      <w:rFonts w:ascii="Arial;Helvetica;sans-serif" w:hAnsi="Arial;Helvetica;sans-serif" w:eastAsia="Arial;Helvetica;sans-serif" w:cs="Arial;Helvetica;sans-serif"/>
-      <w:color w:val="161512"/>
-      <w:sz w:val="24"/>
-      <w:szCs w:val="24"/>
+      <w:rFonts w:ascii="Calibri;Arial;Helvetica;sans-serif" w:hAnsi="Calibri;Arial;Helvetica;sans-serif" w:eastAsia="Calibri;Arial;Helvetica;sans-serif" w:cs="Calibri;Arial;Helvetica;sans-serif"/>
+      <w:color w:val="000000"/>
+      <w:sz w:val="22"/>
+      <w:szCs w:val="22"/>
       <w:lang w:val="pl-PL" w:eastAsia="zh-CN" w:bidi="hi-IN"/>
     </w:rPr>
   </w:style>
@@ -706,14 +685,14 @@
     <w:next w:val="BodyText"/>
     <w:qFormat/>
     <w:pPr>
-      <w:spacing w:lineRule="auto" w:line="252" w:before="240" w:after="120"/>
+      <w:spacing w:lineRule="auto" w:line="288" w:before="240" w:after="270"/>
+      <w:jc w:val="center"/>
     </w:pPr>
     <w:rPr>
-      <w:rFonts w:ascii="Courier New;Courier;monospace" w:hAnsi="Courier New;Courier;monospace" w:eastAsia="Courier New;Courier;monospace" w:cs="Courier New;Courier;monospace"/>
       <w:b/>
       <w:bCs/>
-      <w:sz w:val="51"/>
-      <w:szCs w:val="51"/>
+      <w:sz w:val="40"/>
+      <w:szCs w:val="40"/>
     </w:rPr>
   </w:style>
   <w:style w:type="paragraph" w:styleId="Heading2">
@@ -722,23 +701,21 @@
     <w:next w:val="BodyText"/>
     <w:qFormat/>
     <w:pPr>
+      <w:keepNext w:val="true"/>
       <w:numPr>
         <w:ilvl w:val="0"/>
         <w:numId w:val="0"/>
       </w:numPr>
-      <w:pBdr>
-        <w:top w:val="single" w:sz="12" w:space="14" w:color="161512"/>
-      </w:pBdr>
-      <w:spacing w:lineRule="auto" w:line="252" w:before="510" w:after="120"/>
-      <w:ind w:start="600"/>
+      <w:spacing w:lineRule="auto" w:line="288" w:before="360" w:after="120"/>
+      <w:ind w:start="360" w:end="360"/>
       <w:outlineLvl w:val="1"/>
     </w:pPr>
     <w:rPr>
-      <w:rFonts w:ascii="Courier New;Courier;monospace" w:hAnsi="Courier New;Courier;monospace" w:eastAsia="Courier New;Courier;monospace" w:cs="Courier New;Courier;monospace"/>
+      <w:rFonts w:ascii="Liberation Serif" w:hAnsi="Liberation Serif" w:eastAsia="Songti SC" w:cs="Arial Unicode MS"/>
       <w:b/>
       <w:bCs/>
-      <w:sz w:val="36"/>
-      <w:szCs w:val="36"/>
+      <w:sz w:val="28"/>
+      <w:szCs w:val="28"/>
     </w:rPr>
   </w:style>
   <w:style w:type="character" w:styleId="EndnoteReference">
@@ -766,26 +743,22 @@
   <w:style w:type="character" w:styleId="Hyperlink">
     <w:name w:val="Hyperlink"/>
     <w:rPr>
+      <w:color w:val="0645AD"/>
+      <w:u w:val="single"/>
+    </w:rPr>
+  </w:style>
+  <w:style w:type="character" w:styleId="Strong">
+    <w:name w:val="Strong"/>
+    <w:qFormat/>
+    <w:rPr>
       <w:b/>
       <w:bCs/>
-      <w:color w:val="111111"/>
-      <w:u w:val="single"/>
-    </w:rPr>
-  </w:style>
-  <w:style w:type="character" w:styleId="Strong">
-    <w:name w:val="Strong"/>
-    <w:qFormat/>
-    <w:rPr>
-      <w:b/>
-      <w:bCs/>
     </w:rPr>
   </w:style>
   <w:style w:type="character" w:styleId="FollowedHyperlink">
     <w:name w:val="FollowedHyperlink"/>
     <w:rPr>
-      <w:b/>
-      <w:bCs/>
-      <w:color w:val="111111"/>
+      <w:color w:val="0645AD"/>
       <w:u w:val="single"/>
     </w:rPr>
   </w:style>
@@ -808,11 +781,11 @@
     <w:name w:val="Body Text"/>
     <w:basedOn w:val="Normal"/>
     <w:pPr>
-      <w:spacing w:before="0" w:after="283"/>
+      <w:spacing w:before="0" w:after="150"/>
     </w:pPr>
     <w:rPr>
-      <w:sz w:val="23"/>
-      <w:szCs w:val="23"/>
+      <w:sz w:val="22"/>
+      <w:szCs w:val="22"/>
     </w:rPr>
   </w:style>
   <w:style w:type="paragraph" w:styleId="EnvelopeReturn">

</xml_diff>